<commit_message>
Show the dual-gripper exchange clearly and add the short assignment answer
The simulator now draws both grippers (A and B) on Robot 1 in Setup 2,
animates the 180-degree wrist turn and shows what each gripper holds.
Adds the 4-page assignment answer (sensor list with brand and price),
the exchange figure and the updated Setup 2 state diagram text.

Co-Authored-By: Claude Opus 5.5 <noreply@anthropic.com>
</commit_message>
<xml_diff>
--- a/Sensors_Design_Report.docx
+++ b/Sensors_Design_Report.docx
@@ -19182,7 +19182,7 @@
         </w:rPr>
         <w:t xml:space="preserve">Universal Robots UR10e technical specifications: </w:t>
       </w:r>
-      <w:hyperlink w:history="1" r:id="rIdienjwng1kxihttr_emyo6">
+      <w:hyperlink w:history="1" r:id="rIdrmwed8nqpo3ra4ryrfhft">
         <w:r>
           <w:rPr>
             <w:rStyle w:val="Hyperlink"/>
@@ -19209,7 +19209,7 @@
         </w:rPr>
         <w:t xml:space="preserve">Keyence IL-065 laser displacement sensor head: </w:t>
       </w:r>
-      <w:hyperlink w:history="1" r:id="rId7ish_vcyxueggkzm-t3qo">
+      <w:hyperlink w:history="1" r:id="rIdbvbyvwq4vrjc_1g-h3xof">
         <w:r>
           <w:rPr>
             <w:rStyle w:val="Hyperlink"/>
@@ -19236,7 +19236,7 @@
         </w:rPr>
         <w:t xml:space="preserve">SMC ISA3 digital gap (air catch) sensor: </w:t>
       </w:r>
-      <w:hyperlink w:history="1" r:id="rIdckgl0nc9j1sx_gqoape7k">
+      <w:hyperlink w:history="1" r:id="rIdaku-ost5s1sfq-xxtxbnh">
         <w:r>
           <w:rPr>
             <w:rStyle w:val="Hyperlink"/>
@@ -19263,7 +19263,7 @@
         </w:rPr>
         <w:t xml:space="preserve">Haas M80 / M81 automatic door open / close: </w:t>
       </w:r>
-      <w:hyperlink w:history="1" r:id="rIdrhpzylawsqz8cuknpz_ba">
+      <w:hyperlink w:history="1" r:id="rIdif4-pflvk_vmzvkcj7ra5">
         <w:r>
           <w:rPr>
             <w:rStyle w:val="Hyperlink"/>
@@ -19290,7 +19290,7 @@
         </w:rPr>
         <w:t xml:space="preserve">Haas automatic door option for mills: </w:t>
       </w:r>
-      <w:hyperlink w:history="1" r:id="rIddsqz54qiu59ry9t2wesoj">
+      <w:hyperlink w:history="1" r:id="rIdnvplt1a6g4ztnhtaw4gqg">
         <w:r>
           <w:rPr>
             <w:rStyle w:val="Hyperlink"/>
@@ -19317,7 +19317,7 @@
         </w:rPr>
         <w:t xml:space="preserve">AutomationDirect FFI7-0P-1E photoelectric sensor: </w:t>
       </w:r>
-      <w:hyperlink w:history="1" r:id="rIdthhpbwwuapsqxkuu68gfk">
+      <w:hyperlink w:history="1" r:id="rIdpzmqrhy8pc8n0mm4cmwum">
         <w:r>
           <w:rPr>
             <w:rStyle w:val="Hyperlink"/>
@@ -19344,7 +19344,7 @@
         </w:rPr>
         <w:t xml:space="preserve">AutomationDirect QMIHD-0P-0F through-beam pair: </w:t>
       </w:r>
-      <w:hyperlink w:history="1" r:id="rIdnfw8mlyip0gqr_le3c2ky">
+      <w:hyperlink w:history="1" r:id="rId14oq9b_l3eumtt7wtlt-z">
         <w:r>
           <w:rPr>
             <w:rStyle w:val="Hyperlink"/>
@@ -19371,7 +19371,7 @@
         </w:rPr>
         <w:t xml:space="preserve">Koyo TRD-N600-RZWD rotary encoder: </w:t>
       </w:r>
-      <w:hyperlink w:history="1" r:id="rId4zlsr43fh9sapmcb6j2ic">
+      <w:hyperlink w:history="1" r:id="rId1zerdrk7sfunmxgt-iohl">
         <w:r>
           <w:rPr>
             <w:rStyle w:val="Hyperlink"/>
@@ -19398,7 +19398,7 @@
         </w:rPr>
         <w:t xml:space="preserve">Gefran PY2-F-0010-S-L linear position sensor: </w:t>
       </w:r>
-      <w:hyperlink w:history="1" r:id="rId4f3xevv_mlejjyovgzaye">
+      <w:hyperlink w:history="1" r:id="rIdg23ye9cgptjeyxc62mxqg">
         <w:r>
           <w:rPr>
             <w:rStyle w:val="Hyperlink"/>
@@ -19425,7 +19425,7 @@
         </w:rPr>
         <w:t xml:space="preserve">Patlite ME-102P-R signal light: </w:t>
       </w:r>
-      <w:hyperlink w:history="1" r:id="rIdhzfdbizrshdws4tkoog-s">
+      <w:hyperlink w:history="1" r:id="rIdjjniuujtgb3msvhfspuqc">
         <w:r>
           <w:rPr>
             <w:rStyle w:val="Hyperlink"/>
@@ -19452,7 +19452,7 @@
         </w:rPr>
         <w:t xml:space="preserve">Patlite LR6-302WJBW-RYG signal tower: </w:t>
       </w:r>
-      <w:hyperlink w:history="1" r:id="rIdfxzsjjvkvj96shz016f1y">
+      <w:hyperlink w:history="1" r:id="rId2mgr0sumigqkwengezgi0">
         <w:r>
           <w:rPr>
             <w:rStyle w:val="Hyperlink"/>
@@ -19479,7 +19479,7 @@
         </w:rPr>
         <w:t xml:space="preserve">Cognex: how laser displacement sensors work (course reference): </w:t>
       </w:r>
-      <w:hyperlink w:history="1" r:id="rIdam4itbt1l9b6in-auoc8u">
+      <w:hyperlink w:history="1" r:id="rIdaebl_kr7r6gzetnfyk-_7">
         <w:r>
           <w:rPr>
             <w:rStyle w:val="Hyperlink"/>
@@ -19506,7 +19506,7 @@
         </w:rPr>
         <w:t xml:space="preserve">Balluff and Keyence sensor catalogs (course references): </w:t>
       </w:r>
-      <w:hyperlink w:history="1" r:id="rIdu3hj7ihla5qzfslkwjpxw">
+      <w:hyperlink w:history="1" r:id="rIdisvv0zengp885n-xgladj">
         <w:r>
           <w:rPr>
             <w:rStyle w:val="Hyperlink"/>

</xml_diff>